<commit_message>
feat: login unificado por tipo de cuenta, marca Cogana y ajustes de UI y backend
</commit_message>
<xml_diff>
--- a/Esquema_Backend_Cogana_v1.0.docx
+++ b/Esquema_Backend_Cogana_v1.0.docx
@@ -13,7 +13,7 @@
           <w:color w:val="2E74B5"/>
           <w:sz w:val="26"/>
         </w:rPr>
-        <w:t>COGUANA</w:t>
+        <w:t>COGANA</w:t>
       </w:r>
       <w:r>
         <w:rPr>
@@ -148,7 +148,7 @@
               <w:spacing w:after="0" w:line="240" w:lineRule="auto"/>
             </w:pPr>
             <w:r>
-              <w:t>Coguana</w:t>
+              <w:t>Cogana</w:t>
             </w:r>
           </w:p>
         </w:tc>
@@ -190,7 +190,7 @@
               <w:spacing w:after="0" w:line="240" w:lineRule="auto"/>
             </w:pPr>
             <w:r>
-              <w:t>TRD Coguana v1.0</w:t>
+              <w:t>TRD Cogana v1.0</w:t>
             </w:r>
           </w:p>
         </w:tc>
@@ -825,7 +825,7 @@
     </w:p>
     <w:p>
       <w:r>
-        <w:t>El backend de Coguana utilizará Supabase como plataforma administrada y PostgreSQL como base central. La aplicación móvil conservará SQLite para trabajar sin internet; el backend unificará dispositivos, autenticación, pedidos online y futuras sucursales.</w:t>
+        <w:t>El backend de Cogana utilizará Supabase como plataforma administrada y PostgreSQL como base central. La aplicación móvil conservará SQLite para trabajar sin internet; el backend unificará dispositivos, autenticación, pedidos online y futuras sucursales.</w:t>
       </w:r>
     </w:p>
     <w:p>
@@ -841,7 +841,7 @@
         <w:pStyle w:val="ListBullet"/>
       </w:pPr>
       <w:r>
-        <w:t>Una organización representa al negocio Coguana; una organización puede tener varias tiendas.</w:t>
+        <w:t>Una organización representa al negocio Cogana; una organización puede tener varias tiendas.</w:t>
       </w:r>
     </w:p>
     <w:p>
@@ -2574,7 +2574,7 @@
               <w:spacing w:after="0" w:line="240" w:lineRule="auto"/>
             </w:pPr>
             <w:r>
-              <w:t>Una fila inicial para Coguana.</w:t>
+              <w:t>Una fila inicial para Cogana.</w:t>
             </w:r>
           </w:p>
         </w:tc>
@@ -11089,7 +11089,7 @@
         <w:color w:val="1F4D78"/>
         <w:sz w:val="18"/>
       </w:rPr>
-      <w:t>COGUANA  |  ESQUEMA DE BACKEND</w:t>
+      <w:t>COGANA  |  ESQUEMA DE BACKEND</w:t>
     </w:r>
   </w:p>
 </w:hdr>

</xml_diff>